<commit_message>
Add ZIP media import for Word exam preview.
This lets teachers attach a DOCX with an optional ZIP of media, auto-map matching files during preview, and clean up temporary preview uploads so abandoned previews do not leave orphaned Cloudinary assets.

Co-authored-by: Cursor <cursoragent@cursor.com>
</commit_message>
<xml_diff>
--- a/BackEnd/exam_template_GiaoVien.docx
+++ b/BackEnd/exam_template_GiaoVien.docx
@@ -7,7 +7,7 @@
         <w:rPr>
           <w:b/>
         </w:rPr>
-        <w:t>HƯỚNG DẪN SOẠN ĐỀ (đọc trước khi làm)</w:t>
+        <w:t>HƯỚNG DẪN SOẠN ĐỀ THI BẰNG WORD (FORMAT MỚI)</w:t>
       </w:r>
     </w:p>
     <w:p>
@@ -31,7 +31,7 @@
         <w:rPr>
           <w:sz w:val="24"/>
         </w:rPr>
-        <w:t>• Mỗi câu hỏi bắt đầu bằng MỘT DÒNG THẺ (xem mẫu bên dưới), sau đó gõ nội dung câu hỏi.</w:t>
+        <w:t>• Hệ thống hiện dùng format mới có CHƯƠNG bắt buộc.</w:t>
       </w:r>
     </w:p>
     <w:p>
@@ -39,7 +39,204 @@
         <w:rPr>
           <w:sz w:val="24"/>
         </w:rPr>
-        <w:t>• Sau khi soạn xong: vào hệ thống → Soạn đề → Import file Word → kiểm tra lại → Lưu.</w:t>
+        <w:t>• Nếu thiếu block khai báo CHƯƠNG ở đầu file hoặc thiếu [CHUONG:x] ở từng câu, hệ thống sẽ không cho import hoàn chỉnh.</w:t>
+      </w:r>
+    </w:p>
+    <w:p>
+      <w:r>
+        <w:rPr>
+          <w:sz w:val="24"/>
+        </w:rPr>
+        <w:t>• Sau khi đã hiểu cách soạn, khi tạo đề thật nên xóa phần hướng dẫn của file mẫu và chỉ giữ lại block CHUONG cùng các câu hỏi thật.</w:t>
+      </w:r>
+    </w:p>
+    <w:p>
+      <w:r>
+        <w:rPr>
+          <w:sz w:val="24"/>
+        </w:rPr>
+        <w:t>• Nếu quên xóa, hệ thống sẽ cố gắng tự bỏ qua các dòng hướng dẫn phổ biến và hiển thị cảnh báo khi xem trước.</w:t>
+      </w:r>
+    </w:p>
+    <w:p>
+      <w:r>
+        <w:rPr>
+          <w:sz w:val="24"/>
+        </w:rPr>
+        <w:t>• Sau khi soạn xong: vào hệ thống → Soạn đề → chọn file Word (.docx) → nếu có media thì gửi kèm 1 file ZIP → kiểm tra lại → Lưu.</w:t>
+      </w:r>
+    </w:p>
+    <w:p>
+      <w:r>
+        <w:rPr>
+          <w:sz w:val="24"/>
+        </w:rPr>
+        <w:t>────────────────────────────────────────</w:t>
+      </w:r>
+    </w:p>
+    <w:p>
+      <w:r>
+        <w:t>BƯỚC 1 — KHAI BÁO DANH SÁCH CHƯƠNG Ở ĐẦU FILE (BẮT BUỘC)</w:t>
+      </w:r>
+    </w:p>
+    <w:p>
+      <w:r>
+        <w:t>CHUONG 1 : Biến và kiểu dữ liệu</w:t>
+      </w:r>
+    </w:p>
+    <w:p>
+      <w:r>
+        <w:t>CHUONG 2 : Cấu trúc điều kiện và vòng lặp</w:t>
+      </w:r>
+    </w:p>
+    <w:p>
+      <w:r>
+        <w:t>CHUONG 3 : Hàm</w:t>
+      </w:r>
+    </w:p>
+    <w:p>
+      <w:r>
+        <w:t>Lưu ý:</w:t>
+      </w:r>
+    </w:p>
+    <w:p>
+      <w:r>
+        <w:rPr>
+          <w:sz w:val="24"/>
+        </w:rPr>
+        <w:t>→ Mỗi chương viết trên một dòng riêng</w:t>
+      </w:r>
+    </w:p>
+    <w:p>
+      <w:r>
+        <w:rPr>
+          <w:sz w:val="24"/>
+        </w:rPr>
+        <w:t>→ Số chương phải là số nguyên dương</w:t>
+      </w:r>
+    </w:p>
+    <w:p>
+      <w:r>
+        <w:rPr>
+          <w:sz w:val="24"/>
+        </w:rPr>
+        <w:t>→ Tên chương là nội dung giáo viên tự đặt theo môn học</w:t>
+      </w:r>
+    </w:p>
+    <w:p>
+      <w:r>
+        <w:rPr>
+          <w:sz w:val="24"/>
+        </w:rPr>
+        <w:t>────────────────────────────────────────</w:t>
+      </w:r>
+    </w:p>
+    <w:p>
+      <w:r>
+        <w:t>BƯỚC 2 — CÁC THẺ (TAG) DÙNG CHO MỖI CÂU HỎI</w:t>
+      </w:r>
+    </w:p>
+    <w:p>
+      <w:r>
+        <w:t>Thẻ LOAI:TN         — Bắt buộc, loại câu (TN, TL, TN-ANH, TN-AUDIO, TN-VIDEO)</w:t>
+      </w:r>
+    </w:p>
+    <w:p>
+      <w:r>
+        <w:t>Thẻ DIEM:0.5        — Điểm câu hỏi (ví dụ: 0.5, 1, 2)</w:t>
+      </w:r>
+    </w:p>
+    <w:p>
+      <w:r>
+        <w:t>Thẻ KHO:DE          — Độ khó: DE, TRUNGBINH, KHO</w:t>
+      </w:r>
+    </w:p>
+    <w:p>
+      <w:r>
+        <w:t>Thẻ CHUONG:1        — Bắt buộc, phải khớp với danh sách CHUONG đã khai báo ở đầu file</w:t>
+      </w:r>
+    </w:p>
+    <w:p>
+      <w:r>
+        <w:t>Thẻ ANH:ten.png     — Tên file ảnh (nếu có), ví dụ: [ANH:code_python_loop.png]</w:t>
+      </w:r>
+    </w:p>
+    <w:p>
+      <w:r>
+        <w:t>Thẻ AUDIO:ten.mp3   — Tên file audio (nếu có), ví dụ: [AUDIO:python_question_01.mp3]</w:t>
+      </w:r>
+    </w:p>
+    <w:p>
+      <w:r>
+        <w:t>Thẻ VIDEO:ten.mp4   — Tên file video (nếu có), ví dụ: [VIDEO:python_demo_01.mp4]</w:t>
+      </w:r>
+    </w:p>
+    <w:p>
+      <w:r>
+        <w:t>Thẻ DAPAN:A         — Đáp án đúng (hoặc có thể viết dòng “Đáp án: A” bên dưới)</w:t>
+      </w:r>
+    </w:p>
+    <w:p>
+      <w:r>
+        <w:t>Ví dụ dòng thẻ chuẩn:</w:t>
+      </w:r>
+    </w:p>
+    <w:p>
+      <w:r>
+        <w:t>CAU 1 [LOAI:TN] [DIEM:0.5] [KHO:DE] [CHUONG:1]</w:t>
+      </w:r>
+    </w:p>
+    <w:p>
+      <w:r>
+        <w:t>Lưu ý khi gõ thẻ:</w:t>
+      </w:r>
+    </w:p>
+    <w:p>
+      <w:r>
+        <w:rPr>
+          <w:sz w:val="24"/>
+        </w:rPr>
+        <w:t>→ Mỗi câu phải bắt đầu bằng MỘT dòng thẻ riêng</w:t>
+      </w:r>
+    </w:p>
+    <w:p>
+      <w:r>
+        <w:rPr>
+          <w:sz w:val="24"/>
+        </w:rPr>
+        <w:t>→ Dòng thẻ nên bắt đầu bằng CAU 1 [LOAI:...] hoặc trực tiếp [LOAI:...]</w:t>
+      </w:r>
+    </w:p>
+    <w:p>
+      <w:r>
+        <w:rPr>
+          <w:sz w:val="24"/>
+        </w:rPr>
+        <w:t>→ [CHUONG:x] là bắt buộc cho mọi câu</w:t>
+      </w:r>
+    </w:p>
+    <w:p>
+      <w:r>
+        <w:rPr>
+          <w:sz w:val="24"/>
+        </w:rPr>
+        <w:t>→ Nếu là câu trắc nghiệm thì cần đáp án A/B/C/D và dòng Đáp án</w:t>
+      </w:r>
+    </w:p>
+    <w:p>
+      <w:r>
+        <w:rPr>
+          <w:sz w:val="24"/>
+        </w:rPr>
+        <w:t>→ Nếu là câu tự luận thì không cần A/B/C/D, có thể thêm dòng Gợi ý chấm</w:t>
+      </w:r>
+    </w:p>
+    <w:p>
+      <w:r>
+        <w:rPr>
+          <w:sz w:val="24"/>
+        </w:rPr>
+        <w:t>→ Khi đối chiếu media từ ZIP: hệ thống so theo tên file gốc, không phân biệt hoa/thường, bỏ qua thư mục con, và coi khoảng trắng / dấu gạch ngang / dấu gạch dưới là tương đương</w:t>
       </w:r>
     </w:p>
     <w:p>
@@ -55,175 +252,7 @@
         <w:rPr>
           <w:b/>
         </w:rPr>
-        <w:t>BẢNG 1 — LOẠI CÂU HỎI (chọn một trong các mã sau)</w:t>
-      </w:r>
-    </w:p>
-    <w:p>
-      <w:r>
-        <w:t>TN hoặc mcq  =  TRẮC NGHIỆM (sinh viên chọn A, B, C, D…)</w:t>
-      </w:r>
-    </w:p>
-    <w:p>
-      <w:r>
-        <w:t>TL hoặc essay =  TỰ LUẬN (sinh viên tự viết câu trả lời dài)</w:t>
-      </w:r>
-    </w:p>
-    <w:p>
-      <w:r>
-        <w:t>TN-ANH        =  Trắc nghiệm kèm ảnh (ghi thêm tên file ảnh)</w:t>
-      </w:r>
-    </w:p>
-    <w:p>
-      <w:r>
-        <w:t>TN-AUDIO      =  Trắc nghiệm kèm file nghe (MP3, WAV…)</w:t>
-      </w:r>
-    </w:p>
-    <w:p>
-      <w:r>
-        <w:t>TN-VIDEO      =  Trắc nghiệm kèm video (MP4…)</w:t>
-      </w:r>
-    </w:p>
-    <w:p>
-      <w:r>
-        <w:t>Giải thích mcq và essay (cú pháp cũ, vẫn dùng được):</w:t>
-      </w:r>
-    </w:p>
-    <w:p>
-      <w:r>
-        <w:rPr>
-          <w:sz w:val="24"/>
-        </w:rPr>
-        <w:t>→ mcq   = Multiple Choice Question = câu trắc nghiệm (giống TN)</w:t>
-      </w:r>
-    </w:p>
-    <w:p>
-      <w:r>
-        <w:rPr>
-          <w:sz w:val="24"/>
-        </w:rPr>
-        <w:t>→ essay = câu tự luận, chấm tay (giống TL)</w:t>
-      </w:r>
-    </w:p>
-    <w:p>
-      <w:r>
-        <w:t>Ví dụ so sánh hai cách viết CÙNG MỘT Ý:</w:t>
-      </w:r>
-    </w:p>
-    <w:p>
-      <w:r>
-        <w:rPr>
-          <w:sz w:val="24"/>
-        </w:rPr>
-        <w:t>→ Cách mới:  dòng đầu ghi [LOAI:TN] [DIEM:1]</w:t>
-      </w:r>
-    </w:p>
-    <w:p>
-      <w:r>
-        <w:rPr>
-          <w:sz w:val="24"/>
-        </w:rPr>
-        <w:t>→ Cách cũ:   dòng đầu ghi Q1 [mcq] [1]   (Q1 chỉ là nhãn, số thứ tự tự đếm khi import)</w:t>
-      </w:r>
-    </w:p>
-    <w:p>
-      <w:r>
-        <w:rPr>
-          <w:sz w:val="24"/>
-        </w:rPr>
-        <w:t>────────────────────────────────────────</w:t>
-      </w:r>
-    </w:p>
-    <w:p>
-      <w:r>
-        <w:rPr>
-          <w:b/>
-        </w:rPr>
-        <w:t>BẢNG 2 — CÁC THẺ (TAG) TRONG NGOẶC VUÔNG</w:t>
-      </w:r>
-    </w:p>
-    <w:p>
-      <w:r>
-        <w:t>Thẻ LOAI:TN     — Bắt buộc, loại câu (TN, TL, TN-ANH, TN-AUDIO, TN-VIDEO)</w:t>
-      </w:r>
-    </w:p>
-    <w:p>
-      <w:r>
-        <w:t>Thẻ DIEM:0.5    — Điểm câu hỏi (VD: 0.5, 1, 2). Bỏ thẻ thì mặc định 1 điểm</w:t>
-      </w:r>
-    </w:p>
-    <w:p>
-      <w:r>
-        <w:t>Thẻ KHO:DE      — Độ khó: DE (dễ), TRUNGBINH (trung bình), KHO (khó)</w:t>
-      </w:r>
-    </w:p>
-    <w:p>
-      <w:r>
-        <w:t>Thẻ CHUONG:1    — Chương / chủ đề (số nguyên)</w:t>
-      </w:r>
-    </w:p>
-    <w:p>
-      <w:r>
-        <w:t>Thẻ ANH:ten.png — Tên file ảnh (upload kèm ZIP khi import)</w:t>
-      </w:r>
-    </w:p>
-    <w:p>
-      <w:r>
-        <w:t>Thẻ AUDIO:ten.mp3 — File âm thanh</w:t>
-      </w:r>
-    </w:p>
-    <w:p>
-      <w:r>
-        <w:t>Thẻ VIDEO:ten.mp4 — File video</w:t>
-      </w:r>
-    </w:p>
-    <w:p>
-      <w:r>
-        <w:t>Thẻ DAPAN:A     — Đáp án đúng (hoặc viết dòng Đáp án: A)</w:t>
-      </w:r>
-    </w:p>
-    <w:p>
-      <w:r>
-        <w:t>Lưu ý khi gõ thẻ:</w:t>
-      </w:r>
-    </w:p>
-    <w:p>
-      <w:r>
-        <w:rPr>
-          <w:sz w:val="24"/>
-        </w:rPr>
-        <w:t>→ Mỗi câu: dòng THẺ phải đứng MỘT MÌNH, bắt đầu bằng [LOAI:...]</w:t>
-      </w:r>
-    </w:p>
-    <w:p>
-      <w:r>
-        <w:rPr>
-          <w:sz w:val="24"/>
-        </w:rPr>
-        <w:t>→ Trắc nghiệm: bắt buộc có A. B. C. D. và dòng Đáp án: X</w:t>
-      </w:r>
-    </w:p>
-    <w:p>
-      <w:r>
-        <w:rPr>
-          <w:sz w:val="24"/>
-        </w:rPr>
-        <w:t>→ Tự luận: không cần A/B/C/D; có thể thêm dòng Gợi ý chấm: ...</w:t>
-      </w:r>
-    </w:p>
-    <w:p>
-      <w:r>
-        <w:rPr>
-          <w:sz w:val="24"/>
-        </w:rPr>
-        <w:t>────────────────────────────────────────</w:t>
-      </w:r>
-    </w:p>
-    <w:p>
-      <w:r>
-        <w:rPr>
-          <w:b/>
-        </w:rPr>
-        <w:t>THÔNG TIN ĐỀ THI (đặt trước các câu hỏi, tùy chọn)</w:t>
+        <w:t>THÔNG TIN ĐỀ THI (TÙY CHỌN)</w:t>
       </w:r>
     </w:p>
     <w:p>
@@ -254,17 +283,12 @@
         <w:rPr>
           <w:b/>
         </w:rPr>
-        <w:t>PHẦN MẪU — CÁC CÂU HỎI (xóa nội dung mẫu, thay bằng đề của bạn)</w:t>
+        <w:t>PHẦN MẪU — CÁC CÂU HỎI</w:t>
       </w:r>
     </w:p>
     <w:p>
       <w:r>
-        <w:t>(Mẫu câu 1 — Trắc nghiệm thường)</w:t>
-      </w:r>
-    </w:p>
-    <w:p>
-      <w:r>
-        <w:t>[LOAI:TN] [DIEM:0.5] [KHO:DE] [CHUONG:1]</w:t>
+        <w:t>CAU 1 [LOAI:TN] [DIEM:0.5] [KHO:DE] [CHUONG:1]</w:t>
       </w:r>
     </w:p>
     <w:p>
@@ -299,32 +323,37 @@
     </w:p>
     <w:p>
       <w:r>
-        <w:t>(Mẫu câu 2 — Trắc nghiệm, độ khó trung bình)</w:t>
+        <w:t>CAU 2 [LOAI:TN] [DIEM:0.5] [KHO:TRUNGBINH] [CHUONG:2]</w:t>
       </w:r>
     </w:p>
     <w:p>
       <w:r>
-        <w:t>[LOAI:TN] [DIEM:0.5] [KHO:TRUNGBINH] [CHUONG:1]</w:t>
+        <w:t>Kết quả của đoạn mã sau là gì?</w:t>
       </w:r>
     </w:p>
     <w:p>
       <w:r>
-        <w:t>Kết quả của biểu thức 10 // 3 là bao nhiêu?</w:t>
+        <w:t>for i in range(3):</w:t>
       </w:r>
     </w:p>
     <w:p>
       <w:r>
-        <w:t>A. 3.33</w:t>
+        <w:t xml:space="preserve">    print(i)</w:t>
       </w:r>
     </w:p>
     <w:p>
       <w:r>
-        <w:t>B. 3</w:t>
+        <w:t>A. 1 2 3</w:t>
       </w:r>
     </w:p>
     <w:p>
       <w:r>
-        <w:t>C. 1</w:t>
+        <w:t>B. 0 1 2</w:t>
+      </w:r>
+    </w:p>
+    <w:p>
+      <w:r>
+        <w:t>C. 0 1 2 3</w:t>
       </w:r>
     </w:p>
     <w:p>
@@ -339,12 +368,7 @@
     </w:p>
     <w:p>
       <w:r>
-        <w:t>(Mẫu câu 3 — Trắc nghiệm có ảnh: đặt file code_python_loop.png vào ZIP cùng lúc import)</w:t>
-      </w:r>
-    </w:p>
-    <w:p>
-      <w:r>
-        <w:t>[LOAI:TN-ANH] [DIEM:0.5] [ANH:code_python_loop.png]</w:t>
+        <w:t>CAU 3 [LOAI:TN-ANH] [DIEM:0.5] [KHO:DE] [CHUONG:2] [ANH:code_python_loop.png]</w:t>
       </w:r>
     </w:p>
     <w:p>
@@ -379,12 +403,77 @@
     </w:p>
     <w:p>
       <w:r>
-        <w:t>(Mẫu câu 4 — Tự luận: không cần A/B/C/D, giáo viên chấm tay trên hệ thống)</w:t>
+        <w:t>CAU 4 [LOAI:TN-AUDIO] [DIEM:0.5] [KHO:TRUNGBINH] [CHUONG:2] [AUDIO:python_question_01.mp3]</w:t>
       </w:r>
     </w:p>
     <w:p>
       <w:r>
-        <w:t>[LOAI:TL] [DIEM:2] [KHO:KHO] [CHUONG:2]</w:t>
+        <w:t>Nghe đoạn âm thanh và chọn từ khóa được nhắc đến trong ví dụ.</w:t>
+      </w:r>
+    </w:p>
+    <w:p>
+      <w:r>
+        <w:t>A. list</w:t>
+      </w:r>
+    </w:p>
+    <w:p>
+      <w:r>
+        <w:t>B. tuple</w:t>
+      </w:r>
+    </w:p>
+    <w:p>
+      <w:r>
+        <w:t>C. dictionary</w:t>
+      </w:r>
+    </w:p>
+    <w:p>
+      <w:r>
+        <w:t>D. set</w:t>
+      </w:r>
+    </w:p>
+    <w:p>
+      <w:r>
+        <w:t>Đáp án: C</w:t>
+      </w:r>
+    </w:p>
+    <w:p>
+      <w:r>
+        <w:t>CAU 5 [LOAI:TN-VIDEO] [DIEM:0.5] [KHO:DE] [CHUONG:3] [VIDEO:python_demo_01.mp4]</w:t>
+      </w:r>
+    </w:p>
+    <w:p>
+      <w:r>
+        <w:t>Xem video minh họa và cho biết hàm nào được gọi trong ví dụ.</w:t>
+      </w:r>
+    </w:p>
+    <w:p>
+      <w:r>
+        <w:t>A. print()</w:t>
+      </w:r>
+    </w:p>
+    <w:p>
+      <w:r>
+        <w:t>B. len()</w:t>
+      </w:r>
+    </w:p>
+    <w:p>
+      <w:r>
+        <w:t>C. range()</w:t>
+      </w:r>
+    </w:p>
+    <w:p>
+      <w:r>
+        <w:t>D. input()</w:t>
+      </w:r>
+    </w:p>
+    <w:p>
+      <w:r>
+        <w:t>Đáp án: A</w:t>
+      </w:r>
+    </w:p>
+    <w:p>
+      <w:r>
+        <w:t>CAU 6 [LOAI:TL] [DIEM:2] [KHO:KHO] [CHUONG:3]</w:t>
       </w:r>
     </w:p>
     <w:p>
@@ -407,59 +496,122 @@
     </w:p>
     <w:p>
       <w:r>
-        <w:rPr>
-          <w:b/>
-        </w:rPr>
-        <w:t>PHỤ LỤC — CÚ PHÁP CŨ (Q1 [mcq] [1] — vẫn import được)</w:t>
+        <w:t>MẪU KHUNG SOẠN NHANH CHO GIẢNG VIÊN</w:t>
       </w:r>
     </w:p>
     <w:p>
       <w:r>
-        <w:t>Ghi chú:</w:t>
+        <w:t>CHUONG 1 : ................................</w:t>
       </w:r>
     </w:p>
     <w:p>
       <w:r>
-        <w:rPr>
-          <w:sz w:val="24"/>
-        </w:rPr>
-        <w:t>→ [mcq]   = trắc nghiệm (tương đương [LOAI:TN])</w:t>
+        <w:t>CHUONG 2 : ................................</w:t>
       </w:r>
     </w:p>
     <w:p>
       <w:r>
-        <w:rPr>
-          <w:sz w:val="24"/>
-        </w:rPr>
-        <w:t>→ [essay] = tự luận (tương đương [LOAI:TL])</w:t>
+        <w:t>CHUONG 3 : ................................</w:t>
       </w:r>
     </w:p>
     <w:p>
       <w:r>
-        <w:rPr>
-          <w:sz w:val="24"/>
-        </w:rPr>
-        <w:t>→ Số trong [1] hoặc [3] là ĐIỂM của câu đó</w:t>
+        <w:t>CAU 1 [LOAI:TN] [DIEM:0.5] [KHO:DE] [CHUONG:1]</w:t>
       </w:r>
     </w:p>
     <w:p>
       <w:r>
-        <w:t>Q1 [mcq] [1]</w:t>
+        <w:t>Nội dung câu hỏi...</w:t>
       </w:r>
     </w:p>
     <w:p>
       <w:r>
-        <w:t>Nội dung câu hỏi trắc nghiệm?</w:t>
+        <w:t>A. ...</w:t>
       </w:r>
     </w:p>
     <w:p>
       <w:r>
-        <w:t>A. Đáp án A</w:t>
+        <w:t>B. ...</w:t>
       </w:r>
     </w:p>
     <w:p>
       <w:r>
-        <w:t>B. Đáp án B</w:t>
+        <w:t>C. ...</w:t>
+      </w:r>
+    </w:p>
+    <w:p>
+      <w:r>
+        <w:t>D. ...</w:t>
+      </w:r>
+    </w:p>
+    <w:p>
+      <w:r>
+        <w:t>Đáp án: A</w:t>
+      </w:r>
+    </w:p>
+    <w:p>
+      <w:r>
+        <w:t>CAU 2 [LOAI:TN-ANH] [DIEM:0.5] [KHO:DE] [CHUONG:2] [ANH:ten_anh.png]</w:t>
+      </w:r>
+    </w:p>
+    <w:p>
+      <w:r>
+        <w:t>Nội dung câu hỏi dùng ảnh...</w:t>
+      </w:r>
+    </w:p>
+    <w:p>
+      <w:r>
+        <w:t>A. ...</w:t>
+      </w:r>
+    </w:p>
+    <w:p>
+      <w:r>
+        <w:t>B. ...</w:t>
+      </w:r>
+    </w:p>
+    <w:p>
+      <w:r>
+        <w:t>C. ...</w:t>
+      </w:r>
+    </w:p>
+    <w:p>
+      <w:r>
+        <w:t>D. ...</w:t>
+      </w:r>
+    </w:p>
+    <w:p>
+      <w:r>
+        <w:t>Đáp án: A</w:t>
+      </w:r>
+    </w:p>
+    <w:p>
+      <w:r>
+        <w:t>CAU 3 [LOAI:TN-AUDIO] [DIEM:0.5] [KHO:TRUNGBINH] [CHUONG:2] [AUDIO:ten_audio.mp3]</w:t>
+      </w:r>
+    </w:p>
+    <w:p>
+      <w:r>
+        <w:t>Nội dung câu hỏi dùng audio...</w:t>
+      </w:r>
+    </w:p>
+    <w:p>
+      <w:r>
+        <w:t>A. ...</w:t>
+      </w:r>
+    </w:p>
+    <w:p>
+      <w:r>
+        <w:t>B. ...</w:t>
+      </w:r>
+    </w:p>
+    <w:p>
+      <w:r>
+        <w:t>C. ...</w:t>
+      </w:r>
+    </w:p>
+    <w:p>
+      <w:r>
+        <w:t>D. ...</w:t>
       </w:r>
     </w:p>
     <w:p>
@@ -469,17 +621,52 @@
     </w:p>
     <w:p>
       <w:r>
-        <w:t>Q2 [essay] [3]</w:t>
+        <w:t>CAU 4 [LOAI:TN-VIDEO] [DIEM:0.5] [KHO:DE] [CHUONG:3] [VIDEO:ten_video.mp4]</w:t>
       </w:r>
     </w:p>
     <w:p>
       <w:r>
-        <w:t>Nội dung câu tự luận — sinh viên viết đoạn văn hoặc code, không chọn A/B/C/D.</w:t>
+        <w:t>Nội dung câu hỏi dùng video...</w:t>
       </w:r>
     </w:p>
     <w:p>
       <w:r>
-        <w:t>Gợi ý chấm: (tùy chọn) Mô tả tiêu chí chấm điểm cho giáo viên.</w:t>
+        <w:t>A. ...</w:t>
+      </w:r>
+    </w:p>
+    <w:p>
+      <w:r>
+        <w:t>B. ...</w:t>
+      </w:r>
+    </w:p>
+    <w:p>
+      <w:r>
+        <w:t>C. ...</w:t>
+      </w:r>
+    </w:p>
+    <w:p>
+      <w:r>
+        <w:t>D. ...</w:t>
+      </w:r>
+    </w:p>
+    <w:p>
+      <w:r>
+        <w:t>Đáp án: C</w:t>
+      </w:r>
+    </w:p>
+    <w:p>
+      <w:r>
+        <w:t>CAU 5 [LOAI:TL] [DIEM:2] [KHO:TRUNGBINH] [CHUONG:2]</w:t>
+      </w:r>
+    </w:p>
+    <w:p>
+      <w:r>
+        <w:t>Nội dung câu tự luận...</w:t>
+      </w:r>
+    </w:p>
+    <w:p>
+      <w:r>
+        <w:t>Gợi ý chấm: ...</w:t>
       </w:r>
     </w:p>
     <w:p>
@@ -500,22 +687,42 @@
     </w:p>
     <w:p>
       <w:r>
-        <w:t>1. Mỗi câu trắc nghiệm đã có đủ đáp án A/B/C/D và dòng Đáp án: ...</w:t>
+        <w:t>1. Đã khai báo danh sách CHUONG ở đầu file</w:t>
       </w:r>
     </w:p>
     <w:p>
       <w:r>
-        <w:t>2. Đã điền điểm [DIEM:...] (hoặc [số] nếu dùng cú pháp Q1 [mcq] [1])</w:t>
+        <w:t>2. Mỗi câu đều có [CHUONG:x] hợp lệ</w:t>
       </w:r>
     </w:p>
     <w:p>
       <w:r>
-        <w:t>3. File ảnh/audio/video (nếu có) đã đóng ZIP, tên file khớp với thẻ [ANH:...] / [AUDIO:...] / [VIDEO:...]</w:t>
+        <w:t>3. Mỗi câu trắc nghiệm có đủ A/B/C/D và dòng Đáp án: ...</w:t>
       </w:r>
     </w:p>
     <w:p>
       <w:r>
-        <w:t>4. Import trên hệ thống → xem trước → sửa nếu có cảnh báo → Lưu đề</w:t>
+        <w:t>4. Đã điền [DIEM:...] và [KHO:...]</w:t>
+      </w:r>
+    </w:p>
+    <w:p>
+      <w:r>
+        <w:t>5. Nếu có ảnh/audio/video, nên nộp kèm 1 file ZIP chứa toàn bộ media; hệ thống đối chiếu không phân biệt hoa/thường, bỏ qua thư mục con, và coi space / "-" / "_" là tương đương</w:t>
+      </w:r>
+    </w:p>
+    <w:p>
+      <w:r>
+        <w:t xml:space="preserve">   Ví dụ: [ANH:code_python_loop.png], [AUDIO:python_question_01.mp3], [VIDEO:python_demo_01.mp4]</w:t>
+      </w:r>
+    </w:p>
+    <w:p>
+      <w:r>
+        <w:t>6. Nếu ZIP thiếu file hoặc tên không khớp, hệ thống sẽ báo để tải tay từng media còn thiếu ngay trên màn hình xem trước</w:t>
+      </w:r>
+    </w:p>
+    <w:p>
+      <w:r>
+        <w:t>7. Đã xem trước, sửa cảnh báo nếu có rồi mới lưu đề</w:t>
       </w:r>
     </w:p>
     <w:sectPr>

</xml_diff>

<commit_message>
Update downloadable exam import sample pack.
This replaces the old single-docx template download with a clean import-ready Word sample plus a matching media ZIP so teachers can test the full import flow immediately.

Co-authored-by: Cursor <cursoragent@cursor.com>
</commit_message>
<xml_diff>
--- a/BackEnd/exam_template_GiaoVien.docx
+++ b/BackEnd/exam_template_GiaoVien.docx
@@ -4,81 +4,20 @@
   <w:body>
     <w:p>
       <w:r>
-        <w:rPr>
-          <w:b/>
-        </w:rPr>
-        <w:t>HƯỚNG DẪN SOẠN ĐỀ THI BẰNG WORD (FORMAT MỚI)</w:t>
+        <w:t>Tiêu đề: Đề kiểm tra mẫu — Python cơ bản</w:t>
       </w:r>
     </w:p>
     <w:p>
       <w:r>
-        <w:rPr>
-          <w:b/>
-        </w:rPr>
-        <w:t>GHI CHÚ QUAN TRỌNG CHO GIẢNG VIÊN</w:t>
+        <w:t>Thời gian: 45</w:t>
       </w:r>
     </w:p>
     <w:p>
       <w:r>
-        <w:rPr>
-          <w:sz w:val="24"/>
-        </w:rPr>
-        <w:t>• Chỉ cần gõ chữ trong Word — KHÔNG cần tô màu, vẽ khung, banner hay bố cục phức tạp.</w:t>
+        <w:t>Mô tả: File mẫu sạch để import trực tiếp.</w:t>
       </w:r>
     </w:p>
-    <w:p>
-      <w:r>
-        <w:rPr>
-          <w:sz w:val="24"/>
-        </w:rPr>
-        <w:t>• Hệ thống hiện dùng format mới có CHƯƠNG bắt buộc.</w:t>
-      </w:r>
-    </w:p>
-    <w:p>
-      <w:r>
-        <w:rPr>
-          <w:sz w:val="24"/>
-        </w:rPr>
-        <w:t>• Nếu thiếu block khai báo CHƯƠNG ở đầu file hoặc thiếu [CHUONG:x] ở từng câu, hệ thống sẽ không cho import hoàn chỉnh.</w:t>
-      </w:r>
-    </w:p>
-    <w:p>
-      <w:r>
-        <w:rPr>
-          <w:sz w:val="24"/>
-        </w:rPr>
-        <w:t>• Sau khi đã hiểu cách soạn, khi tạo đề thật nên xóa phần hướng dẫn của file mẫu và chỉ giữ lại block CHUONG cùng các câu hỏi thật.</w:t>
-      </w:r>
-    </w:p>
-    <w:p>
-      <w:r>
-        <w:rPr>
-          <w:sz w:val="24"/>
-        </w:rPr>
-        <w:t>• Nếu quên xóa, hệ thống sẽ cố gắng tự bỏ qua các dòng hướng dẫn phổ biến và hiển thị cảnh báo khi xem trước.</w:t>
-      </w:r>
-    </w:p>
-    <w:p>
-      <w:r>
-        <w:rPr>
-          <w:sz w:val="24"/>
-        </w:rPr>
-        <w:t>• Sau khi soạn xong: vào hệ thống → Soạn đề → chọn file Word (.docx) → nếu có media thì gửi kèm 1 file ZIP → kiểm tra lại → Lưu.</w:t>
-      </w:r>
-    </w:p>
-    <w:p>
-      <w:r>
-        <w:rPr>
-          <w:sz w:val="24"/>
-        </w:rPr>
-        <w:t>────────────────────────────────────────</w:t>
-      </w:r>
-    </w:p>
-    <w:p>
-      <w:r>
-        <w:t>BƯỚC 1 — KHAI BÁO DANH SÁCH CHƯƠNG Ở ĐẦU FILE (BẮT BUỘC)</w:t>
-      </w:r>
-    </w:p>
+    <w:p/>
     <w:p>
       <w:r>
         <w:t>CHUONG 1 : Biến và kiểu dữ liệu</w:t>
@@ -94,198 +33,7 @@
         <w:t>CHUONG 3 : Hàm</w:t>
       </w:r>
     </w:p>
-    <w:p>
-      <w:r>
-        <w:t>Lưu ý:</w:t>
-      </w:r>
-    </w:p>
-    <w:p>
-      <w:r>
-        <w:rPr>
-          <w:sz w:val="24"/>
-        </w:rPr>
-        <w:t>→ Mỗi chương viết trên một dòng riêng</w:t>
-      </w:r>
-    </w:p>
-    <w:p>
-      <w:r>
-        <w:rPr>
-          <w:sz w:val="24"/>
-        </w:rPr>
-        <w:t>→ Số chương phải là số nguyên dương</w:t>
-      </w:r>
-    </w:p>
-    <w:p>
-      <w:r>
-        <w:rPr>
-          <w:sz w:val="24"/>
-        </w:rPr>
-        <w:t>→ Tên chương là nội dung giáo viên tự đặt theo môn học</w:t>
-      </w:r>
-    </w:p>
-    <w:p>
-      <w:r>
-        <w:rPr>
-          <w:sz w:val="24"/>
-        </w:rPr>
-        <w:t>────────────────────────────────────────</w:t>
-      </w:r>
-    </w:p>
-    <w:p>
-      <w:r>
-        <w:t>BƯỚC 2 — CÁC THẺ (TAG) DÙNG CHO MỖI CÂU HỎI</w:t>
-      </w:r>
-    </w:p>
-    <w:p>
-      <w:r>
-        <w:t>Thẻ LOAI:TN         — Bắt buộc, loại câu (TN, TL, TN-ANH, TN-AUDIO, TN-VIDEO)</w:t>
-      </w:r>
-    </w:p>
-    <w:p>
-      <w:r>
-        <w:t>Thẻ DIEM:0.5        — Điểm câu hỏi (ví dụ: 0.5, 1, 2)</w:t>
-      </w:r>
-    </w:p>
-    <w:p>
-      <w:r>
-        <w:t>Thẻ KHO:DE          — Độ khó: DE, TRUNGBINH, KHO</w:t>
-      </w:r>
-    </w:p>
-    <w:p>
-      <w:r>
-        <w:t>Thẻ CHUONG:1        — Bắt buộc, phải khớp với danh sách CHUONG đã khai báo ở đầu file</w:t>
-      </w:r>
-    </w:p>
-    <w:p>
-      <w:r>
-        <w:t>Thẻ ANH:ten.png     — Tên file ảnh (nếu có), ví dụ: [ANH:code_python_loop.png]</w:t>
-      </w:r>
-    </w:p>
-    <w:p>
-      <w:r>
-        <w:t>Thẻ AUDIO:ten.mp3   — Tên file audio (nếu có), ví dụ: [AUDIO:python_question_01.mp3]</w:t>
-      </w:r>
-    </w:p>
-    <w:p>
-      <w:r>
-        <w:t>Thẻ VIDEO:ten.mp4   — Tên file video (nếu có), ví dụ: [VIDEO:python_demo_01.mp4]</w:t>
-      </w:r>
-    </w:p>
-    <w:p>
-      <w:r>
-        <w:t>Thẻ DAPAN:A         — Đáp án đúng (hoặc có thể viết dòng “Đáp án: A” bên dưới)</w:t>
-      </w:r>
-    </w:p>
-    <w:p>
-      <w:r>
-        <w:t>Ví dụ dòng thẻ chuẩn:</w:t>
-      </w:r>
-    </w:p>
-    <w:p>
-      <w:r>
-        <w:t>CAU 1 [LOAI:TN] [DIEM:0.5] [KHO:DE] [CHUONG:1]</w:t>
-      </w:r>
-    </w:p>
-    <w:p>
-      <w:r>
-        <w:t>Lưu ý khi gõ thẻ:</w:t>
-      </w:r>
-    </w:p>
-    <w:p>
-      <w:r>
-        <w:rPr>
-          <w:sz w:val="24"/>
-        </w:rPr>
-        <w:t>→ Mỗi câu phải bắt đầu bằng MỘT dòng thẻ riêng</w:t>
-      </w:r>
-    </w:p>
-    <w:p>
-      <w:r>
-        <w:rPr>
-          <w:sz w:val="24"/>
-        </w:rPr>
-        <w:t>→ Dòng thẻ nên bắt đầu bằng CAU 1 [LOAI:...] hoặc trực tiếp [LOAI:...]</w:t>
-      </w:r>
-    </w:p>
-    <w:p>
-      <w:r>
-        <w:rPr>
-          <w:sz w:val="24"/>
-        </w:rPr>
-        <w:t>→ [CHUONG:x] là bắt buộc cho mọi câu</w:t>
-      </w:r>
-    </w:p>
-    <w:p>
-      <w:r>
-        <w:rPr>
-          <w:sz w:val="24"/>
-        </w:rPr>
-        <w:t>→ Nếu là câu trắc nghiệm thì cần đáp án A/B/C/D và dòng Đáp án</w:t>
-      </w:r>
-    </w:p>
-    <w:p>
-      <w:r>
-        <w:rPr>
-          <w:sz w:val="24"/>
-        </w:rPr>
-        <w:t>→ Nếu là câu tự luận thì không cần A/B/C/D, có thể thêm dòng Gợi ý chấm</w:t>
-      </w:r>
-    </w:p>
-    <w:p>
-      <w:r>
-        <w:rPr>
-          <w:sz w:val="24"/>
-        </w:rPr>
-        <w:t>→ Khi đối chiếu media từ ZIP: hệ thống so theo tên file gốc, không phân biệt hoa/thường, bỏ qua thư mục con, và coi khoảng trắng / dấu gạch ngang / dấu gạch dưới là tương đương</w:t>
-      </w:r>
-    </w:p>
-    <w:p>
-      <w:r>
-        <w:rPr>
-          <w:sz w:val="24"/>
-        </w:rPr>
-        <w:t>────────────────────────────────────────</w:t>
-      </w:r>
-    </w:p>
-    <w:p>
-      <w:r>
-        <w:rPr>
-          <w:b/>
-        </w:rPr>
-        <w:t>THÔNG TIN ĐỀ THI (TÙY CHỌN)</w:t>
-      </w:r>
-    </w:p>
-    <w:p>
-      <w:r>
-        <w:t>Tiêu đề: Đề kiểm tra mẫu — Python cơ bản</w:t>
-      </w:r>
-    </w:p>
-    <w:p>
-      <w:r>
-        <w:t>Thời gian: 45</w:t>
-      </w:r>
-    </w:p>
-    <w:p>
-      <w:r>
-        <w:t>Mô tả: (có thể ghi thêm yêu cầu chung của đề)</w:t>
-      </w:r>
-    </w:p>
-    <w:p>
-      <w:r>
-        <w:rPr>
-          <w:sz w:val="24"/>
-        </w:rPr>
-        <w:t>────────────────────────────────────────</w:t>
-      </w:r>
-    </w:p>
-    <w:p>
-      <w:r>
-        <w:rPr>
-          <w:b/>
-        </w:rPr>
-        <w:t>PHẦN MẪU — CÁC CÂU HỎI</w:t>
-      </w:r>
-    </w:p>
+    <w:p/>
     <w:p>
       <w:r>
         <w:t>CAU 1 [LOAI:TN] [DIEM:0.5] [KHO:DE] [CHUONG:1]</w:t>
@@ -321,6 +69,7 @@
         <w:t>Đáp án: A</w:t>
       </w:r>
     </w:p>
+    <w:p/>
     <w:p>
       <w:r>
         <w:t>CAU 2 [LOAI:TN] [DIEM:0.5] [KHO:TRUNGBINH] [CHUONG:2]</w:t>
@@ -366,6 +115,7 @@
         <w:t>Đáp án: B</w:t>
       </w:r>
     </w:p>
+    <w:p/>
     <w:p>
       <w:r>
         <w:t>CAU 3 [LOAI:TN-ANH] [DIEM:0.5] [KHO:DE] [CHUONG:2] [ANH:code_python_loop.png]</w:t>
@@ -373,42 +123,43 @@
     </w:p>
     <w:p>
       <w:r>
-        <w:t>Quan sát đoạn code trong ảnh. Kết quả in ra là gì?</w:t>
+        <w:t>Quan sát hình minh họa vòng lặp và chọn đáp án đúng.</w:t>
       </w:r>
     </w:p>
     <w:p>
       <w:r>
-        <w:t>A. 0 1 2 3 4</w:t>
+        <w:t>A. Vòng lặp chạy 1 lần</w:t>
       </w:r>
     </w:p>
     <w:p>
       <w:r>
-        <w:t>B. 1 2 3 4 5</w:t>
+        <w:t>B. Vòng lặp chạy 2 lần</w:t>
       </w:r>
     </w:p>
     <w:p>
       <w:r>
-        <w:t>C. 0 1 2 3</w:t>
+        <w:t>C. Vòng lặp chạy 3 lần</w:t>
       </w:r>
     </w:p>
     <w:p>
       <w:r>
-        <w:t>D. 1 2 3 4</w:t>
+        <w:t>D. Vòng lặp chạy vô hạn</w:t>
       </w:r>
     </w:p>
     <w:p>
       <w:r>
-        <w:t>Đáp án: A</w:t>
+        <w:t>Đáp án: C</w:t>
+      </w:r>
+    </w:p>
+    <w:p/>
+    <w:p>
+      <w:r>
+        <w:t>CAU 4 [LOAI:TN-AUDIO] [DIEM:0.5] [KHO:TRUNGBINH] [CHUONG:2] [AUDIO:python_question_01.wav]</w:t>
       </w:r>
     </w:p>
     <w:p>
       <w:r>
-        <w:t>CAU 4 [LOAI:TN-AUDIO] [DIEM:0.5] [KHO:TRUNGBINH] [CHUONG:2] [AUDIO:python_question_01.mp3]</w:t>
-      </w:r>
-    </w:p>
-    <w:p>
-      <w:r>
-        <w:t>Nghe đoạn âm thanh và chọn từ khóa được nhắc đến trong ví dụ.</w:t>
+        <w:t>Nghe đoạn âm thanh mẫu và chọn từ khóa được nhắc đến trong ví dụ.</w:t>
       </w:r>
     </w:p>
     <w:p>
@@ -436,6 +187,7 @@
         <w:t>Đáp án: C</w:t>
       </w:r>
     </w:p>
+    <w:p/>
     <w:p>
       <w:r>
         <w:t>CAU 5 [LOAI:TN-VIDEO] [DIEM:0.5] [KHO:DE] [CHUONG:3] [VIDEO:python_demo_01.mp4]</w:t>
@@ -471,6 +223,7 @@
         <w:t>Đáp án: A</w:t>
       </w:r>
     </w:p>
+    <w:p/>
     <w:p>
       <w:r>
         <w:t>CAU 6 [LOAI:TL] [DIEM:2] [KHO:KHO] [CHUONG:3]</w:t>
@@ -486,245 +239,7 @@
         <w:t>Gợi ý chấm: Hàm đúng 1đ; giải thích O(√n) 1đ.</w:t>
       </w:r>
     </w:p>
-    <w:p>
-      <w:r>
-        <w:rPr>
-          <w:sz w:val="24"/>
-        </w:rPr>
-        <w:t>────────────────────────────────────────</w:t>
-      </w:r>
-    </w:p>
-    <w:p>
-      <w:r>
-        <w:t>MẪU KHUNG SOẠN NHANH CHO GIẢNG VIÊN</w:t>
-      </w:r>
-    </w:p>
-    <w:p>
-      <w:r>
-        <w:t>CHUONG 1 : ................................</w:t>
-      </w:r>
-    </w:p>
-    <w:p>
-      <w:r>
-        <w:t>CHUONG 2 : ................................</w:t>
-      </w:r>
-    </w:p>
-    <w:p>
-      <w:r>
-        <w:t>CHUONG 3 : ................................</w:t>
-      </w:r>
-    </w:p>
-    <w:p>
-      <w:r>
-        <w:t>CAU 1 [LOAI:TN] [DIEM:0.5] [KHO:DE] [CHUONG:1]</w:t>
-      </w:r>
-    </w:p>
-    <w:p>
-      <w:r>
-        <w:t>Nội dung câu hỏi...</w:t>
-      </w:r>
-    </w:p>
-    <w:p>
-      <w:r>
-        <w:t>A. ...</w:t>
-      </w:r>
-    </w:p>
-    <w:p>
-      <w:r>
-        <w:t>B. ...</w:t>
-      </w:r>
-    </w:p>
-    <w:p>
-      <w:r>
-        <w:t>C. ...</w:t>
-      </w:r>
-    </w:p>
-    <w:p>
-      <w:r>
-        <w:t>D. ...</w:t>
-      </w:r>
-    </w:p>
-    <w:p>
-      <w:r>
-        <w:t>Đáp án: A</w:t>
-      </w:r>
-    </w:p>
-    <w:p>
-      <w:r>
-        <w:t>CAU 2 [LOAI:TN-ANH] [DIEM:0.5] [KHO:DE] [CHUONG:2] [ANH:ten_anh.png]</w:t>
-      </w:r>
-    </w:p>
-    <w:p>
-      <w:r>
-        <w:t>Nội dung câu hỏi dùng ảnh...</w:t>
-      </w:r>
-    </w:p>
-    <w:p>
-      <w:r>
-        <w:t>A. ...</w:t>
-      </w:r>
-    </w:p>
-    <w:p>
-      <w:r>
-        <w:t>B. ...</w:t>
-      </w:r>
-    </w:p>
-    <w:p>
-      <w:r>
-        <w:t>C. ...</w:t>
-      </w:r>
-    </w:p>
-    <w:p>
-      <w:r>
-        <w:t>D. ...</w:t>
-      </w:r>
-    </w:p>
-    <w:p>
-      <w:r>
-        <w:t>Đáp án: A</w:t>
-      </w:r>
-    </w:p>
-    <w:p>
-      <w:r>
-        <w:t>CAU 3 [LOAI:TN-AUDIO] [DIEM:0.5] [KHO:TRUNGBINH] [CHUONG:2] [AUDIO:ten_audio.mp3]</w:t>
-      </w:r>
-    </w:p>
-    <w:p>
-      <w:r>
-        <w:t>Nội dung câu hỏi dùng audio...</w:t>
-      </w:r>
-    </w:p>
-    <w:p>
-      <w:r>
-        <w:t>A. ...</w:t>
-      </w:r>
-    </w:p>
-    <w:p>
-      <w:r>
-        <w:t>B. ...</w:t>
-      </w:r>
-    </w:p>
-    <w:p>
-      <w:r>
-        <w:t>C. ...</w:t>
-      </w:r>
-    </w:p>
-    <w:p>
-      <w:r>
-        <w:t>D. ...</w:t>
-      </w:r>
-    </w:p>
-    <w:p>
-      <w:r>
-        <w:t>Đáp án: B</w:t>
-      </w:r>
-    </w:p>
-    <w:p>
-      <w:r>
-        <w:t>CAU 4 [LOAI:TN-VIDEO] [DIEM:0.5] [KHO:DE] [CHUONG:3] [VIDEO:ten_video.mp4]</w:t>
-      </w:r>
-    </w:p>
-    <w:p>
-      <w:r>
-        <w:t>Nội dung câu hỏi dùng video...</w:t>
-      </w:r>
-    </w:p>
-    <w:p>
-      <w:r>
-        <w:t>A. ...</w:t>
-      </w:r>
-    </w:p>
-    <w:p>
-      <w:r>
-        <w:t>B. ...</w:t>
-      </w:r>
-    </w:p>
-    <w:p>
-      <w:r>
-        <w:t>C. ...</w:t>
-      </w:r>
-    </w:p>
-    <w:p>
-      <w:r>
-        <w:t>D. ...</w:t>
-      </w:r>
-    </w:p>
-    <w:p>
-      <w:r>
-        <w:t>Đáp án: C</w:t>
-      </w:r>
-    </w:p>
-    <w:p>
-      <w:r>
-        <w:t>CAU 5 [LOAI:TL] [DIEM:2] [KHO:TRUNGBINH] [CHUONG:2]</w:t>
-      </w:r>
-    </w:p>
-    <w:p>
-      <w:r>
-        <w:t>Nội dung câu tự luận...</w:t>
-      </w:r>
-    </w:p>
-    <w:p>
-      <w:r>
-        <w:t>Gợi ý chấm: ...</w:t>
-      </w:r>
-    </w:p>
-    <w:p>
-      <w:r>
-        <w:rPr>
-          <w:sz w:val="24"/>
-        </w:rPr>
-        <w:t>────────────────────────────────────────</w:t>
-      </w:r>
-    </w:p>
-    <w:p>
-      <w:r>
-        <w:rPr>
-          <w:b/>
-        </w:rPr>
-        <w:t>CHECKLIST TRƯỚC KHI NỘP</w:t>
-      </w:r>
-    </w:p>
-    <w:p>
-      <w:r>
-        <w:t>1. Đã khai báo danh sách CHUONG ở đầu file</w:t>
-      </w:r>
-    </w:p>
-    <w:p>
-      <w:r>
-        <w:t>2. Mỗi câu đều có [CHUONG:x] hợp lệ</w:t>
-      </w:r>
-    </w:p>
-    <w:p>
-      <w:r>
-        <w:t>3. Mỗi câu trắc nghiệm có đủ A/B/C/D và dòng Đáp án: ...</w:t>
-      </w:r>
-    </w:p>
-    <w:p>
-      <w:r>
-        <w:t>4. Đã điền [DIEM:...] và [KHO:...]</w:t>
-      </w:r>
-    </w:p>
-    <w:p>
-      <w:r>
-        <w:t>5. Nếu có ảnh/audio/video, nên nộp kèm 1 file ZIP chứa toàn bộ media; hệ thống đối chiếu không phân biệt hoa/thường, bỏ qua thư mục con, và coi space / "-" / "_" là tương đương</w:t>
-      </w:r>
-    </w:p>
-    <w:p>
-      <w:r>
-        <w:t xml:space="preserve">   Ví dụ: [ANH:code_python_loop.png], [AUDIO:python_question_01.mp3], [VIDEO:python_demo_01.mp4]</w:t>
-      </w:r>
-    </w:p>
-    <w:p>
-      <w:r>
-        <w:t>6. Nếu ZIP thiếu file hoặc tên không khớp, hệ thống sẽ báo để tải tay từng media còn thiếu ngay trên màn hình xem trước</w:t>
-      </w:r>
-    </w:p>
-    <w:p>
-      <w:r>
-        <w:t>7. Đã xem trước, sửa cảnh báo nếu có rồi mới lưu đề</w:t>
-      </w:r>
-    </w:p>
+    <w:p/>
     <w:sectPr>
       <w:pgSz w:w="12240" w:h="15840"/>
       <w:pgMar w:top="1440" w:right="1800" w:bottom="1440" w:left="1800" w:header="720" w:footer="720" w:gutter="0"/>

</xml_diff>